<commit_message>
feat: Added new console test 1
</commit_message>
<xml_diff>
--- a/SZOFTECH_Lab4_R29SVR.docx
+++ b/SZOFTECH_Lab4_R29SVR.docx
@@ -1,6 +1,6 @@
 
 <file path=word/document.xml><?xml version="1.0" encoding="utf-8"?>
-<w:document xmlns:wpc="http://schemas.microsoft.com/office/word/2010/wordprocessingCanvas" xmlns:cx="http://schemas.microsoft.com/office/drawing/2014/chartex" xmlns:cx1="http://schemas.microsoft.com/office/drawing/2015/9/8/chartex" xmlns:cx2="http://schemas.microsoft.com/office/drawing/2015/10/21/chartex" xmlns:cx3="http://schemas.microsoft.com/office/drawing/2016/5/9/chartex" xmlns:cx4="http://schemas.microsoft.com/office/drawing/2016/5/10/chartex" xmlns:cx5="http://schemas.microsoft.com/office/drawing/2016/5/11/chartex" xmlns:cx6="http://schemas.microsoft.com/office/drawing/2016/5/12/chartex" xmlns:cx7="http://schemas.microsoft.com/office/drawing/2016/5/13/chartex" xmlns:cx8="http://schemas.microsoft.com/office/drawing/2016/5/14/chartex" xmlns:mc="http://schemas.openxmlformats.org/markup-compatibility/2006" xmlns:aink="http://schemas.microsoft.com/office/drawing/2016/ink" xmlns:am3d="http://schemas.microsoft.com/office/drawing/2017/model3d" xmlns:o="urn:schemas-microsoft-com:office:office" xmlns:oel="http://schemas.microsoft.com/office/2019/extlst" xmlns:r="http://schemas.openxmlformats.org/officeDocument/2006/relationships" xmlns:m="http://schemas.openxmlformats.org/officeDocument/2006/math" xmlns:v="urn:schemas-microsoft-com:vml" xmlns:wp14="http://schemas.microsoft.com/office/word/2010/wordprocessingDrawing" xmlns:wp="http://schemas.openxmlformats.org/drawingml/2006/wordprocessingDrawing" xmlns:w10="urn:schemas-microsoft-com:office:word" xmlns:w="http://schemas.openxmlformats.org/wordprocessingml/2006/main" xmlns:w14="http://schemas.microsoft.com/office/word/2010/wordml" xmlns:w15="http://schemas.microsoft.com/office/word/2012/wordml" xmlns:w16cex="http://schemas.microsoft.com/office/word/2018/wordml/cex" xmlns:w16cid="http://schemas.microsoft.com/office/word/2016/wordml/cid" xmlns:w16="http://schemas.microsoft.com/office/word/2018/wordml" xmlns:w16du="http://schemas.microsoft.com/office/word/2023/wordml/word16du" xmlns:w16sdtdh="http://schemas.microsoft.com/office/word/2020/wordml/sdtdatahash" xmlns:w16sdtfl="http://schemas.microsoft.com/office/word/2024/wordml/sdtformatlock" xmlns:w16se="http://schemas.microsoft.com/office/word/2015/wordml/symex" xmlns:wpg="http://schemas.microsoft.com/office/word/2010/wordprocessingGroup" xmlns:wpi="http://schemas.microsoft.com/office/word/2010/wordprocessingInk" xmlns:wne="http://schemas.microsoft.com/office/word/2006/wordml" xmlns:wps="http://schemas.microsoft.com/office/word/2010/wordprocessingShape" mc:Ignorable="w14 w15 w16se w16cid w16 w16cex w16sdtdh w16sdtfl w16du wp14">
+<w:document xmlns:wpc="http://schemas.microsoft.com/office/word/2010/wordprocessingCanvas" xmlns:cx="http://schemas.microsoft.com/office/drawing/2014/chartex" xmlns:cx1="http://schemas.microsoft.com/office/drawing/2015/9/8/chartex" xmlns:cx2="http://schemas.microsoft.com/office/drawing/2015/10/21/chartex" xmlns:cx3="http://schemas.microsoft.com/office/drawing/2016/5/9/chartex" xmlns:cx4="http://schemas.microsoft.com/office/drawing/2016/5/10/chartex" xmlns:cx5="http://schemas.microsoft.com/office/drawing/2016/5/11/chartex" xmlns:cx6="http://schemas.microsoft.com/office/drawing/2016/5/12/chartex" xmlns:cx7="http://schemas.microsoft.com/office/drawing/2016/5/13/chartex" xmlns:cx8="http://schemas.microsoft.com/office/drawing/2016/5/14/chartex" xmlns:mc="http://schemas.openxmlformats.org/markup-compatibility/2006" xmlns:aink="http://schemas.microsoft.com/office/drawing/2016/ink" xmlns:am3d="http://schemas.microsoft.com/office/drawing/2017/model3d" xmlns:o="urn:schemas-microsoft-com:office:office" xmlns:oel="http://schemas.microsoft.com/office/2019/extlst" xmlns:r="http://schemas.openxmlformats.org/officeDocument/2006/relationships" xmlns:m="http://schemas.openxmlformats.org/officeDocument/2006/math" xmlns:v="urn:schemas-microsoft-com:vml" xmlns:wp14="http://schemas.microsoft.com/office/word/2010/wordprocessingDrawing" xmlns:wp="http://schemas.openxmlformats.org/drawingml/2006/wordprocessingDrawing" xmlns:w10="urn:schemas-microsoft-com:office:word" xmlns:w="http://schemas.openxmlformats.org/wordprocessingml/2006/main" xmlns:w14="http://schemas.microsoft.com/office/word/2010/wordml" xmlns:w15="http://schemas.microsoft.com/office/word/2012/wordml" xmlns:w16cex="http://schemas.microsoft.com/office/word/2018/wordml/cex" xmlns:w16cid="http://schemas.microsoft.com/office/word/2016/wordml/cid" xmlns:w16="http://schemas.microsoft.com/office/word/2018/wordml" xmlns:w16sdtdh="http://schemas.microsoft.com/office/word/2020/wordml/sdtdatahash" xmlns:w16se="http://schemas.microsoft.com/office/word/2015/wordml/symex" xmlns:wpg="http://schemas.microsoft.com/office/word/2010/wordprocessingGroup" xmlns:wpi="http://schemas.microsoft.com/office/word/2010/wordprocessingInk" xmlns:wne="http://schemas.microsoft.com/office/word/2006/wordml" xmlns:wps="http://schemas.microsoft.com/office/word/2010/wordprocessingShape" mc:Ignorable="w14 w15 w16se w16cid w16 w16cex w16sdtdh wp14">
   <w:body>
     <w:p>
       <w:pPr>
@@ -160,6 +160,7 @@
           <w:sz w:val="22"/>
         </w:rPr>
       </w:pPr>
+      <w:proofErr w:type="spellStart"/>
       <w:r>
         <w:rPr>
           <w:rFonts w:asciiTheme="minorHAnsi" w:eastAsiaTheme="minorEastAsia" w:hAnsiTheme="minorHAnsi" w:cs="Times New Roman"/>
@@ -167,7 +168,17 @@
           <w:bCs/>
           <w:sz w:val="22"/>
         </w:rPr>
-        <w:t>Antalics Péter</w:t>
+        <w:t>Antalics</w:t>
+      </w:r>
+      <w:proofErr w:type="spellEnd"/>
+      <w:r>
+        <w:rPr>
+          <w:rFonts w:asciiTheme="minorHAnsi" w:eastAsiaTheme="minorEastAsia" w:hAnsiTheme="minorHAnsi" w:cs="Times New Roman"/>
+          <w:b/>
+          <w:bCs/>
+          <w:sz w:val="22"/>
+        </w:rPr>
+        <w:t xml:space="preserve"> Péter</w:t>
       </w:r>
       <w:r>
         <w:rPr>
@@ -295,8 +306,21 @@
         <w:lastRenderedPageBreak/>
         <w:t xml:space="preserve">Feladat: </w:t>
       </w:r>
-      <w:r>
-        <w:t>Branch protection szabály konfigurálása</w:t>
+      <w:proofErr w:type="spellStart"/>
+      <w:r>
+        <w:t>Branch</w:t>
+      </w:r>
+      <w:proofErr w:type="spellEnd"/>
+      <w:r>
+        <w:t xml:space="preserve"> </w:t>
+      </w:r>
+      <w:proofErr w:type="spellStart"/>
+      <w:r>
+        <w:t>protection</w:t>
+      </w:r>
+      <w:proofErr w:type="spellEnd"/>
+      <w:r>
+        <w:t xml:space="preserve"> szabály konfigurálása</w:t>
       </w:r>
     </w:p>
     <w:p>
@@ -509,10 +533,7 @@
         <w:pStyle w:val="Code"/>
       </w:pPr>
       <w:r>
-        <w:t xml:space="preserve">HELP -&gt; </w:t>
-      </w:r>
-      <w:r>
-        <w:t>Available commands: [GT4500, HELP, EXIT, TORPEDO]</w:t>
+        <w:t>HELP -&gt; Available commands: [GT4500, HELP, EXIT, TORPEDO]</w:t>
       </w:r>
     </w:p>
     <w:p>
@@ -546,11 +567,140 @@
       <w:r>
         <w:t xml:space="preserve">Feladat: </w:t>
       </w:r>
-    </w:p>
+      <w:r>
+        <w:t>Teszttervezés</w:t>
+      </w:r>
+    </w:p>
+    <w:tbl>
+      <w:tblPr>
+        <w:tblStyle w:val="Rcsostblzat"/>
+        <w:tblW w:w="0" w:type="auto"/>
+        <w:tblLook w:val="04A0" w:firstRow="1" w:lastRow="0" w:firstColumn="1" w:lastColumn="0" w:noHBand="0" w:noVBand="1"/>
+      </w:tblPr>
+      <w:tblGrid>
+        <w:gridCol w:w="4606"/>
+        <w:gridCol w:w="4606"/>
+      </w:tblGrid>
+      <w:tr>
+        <w:tc>
+          <w:tcPr>
+            <w:tcW w:w="4606" w:type="dxa"/>
+          </w:tcPr>
+          <w:p>
+            <w:pPr>
+              <w:pStyle w:val="Code"/>
+            </w:pPr>
+            <w:r>
+              <w:t>Teszt követelmény</w:t>
+            </w:r>
+          </w:p>
+        </w:tc>
+        <w:tc>
+          <w:tcPr>
+            <w:tcW w:w="4606" w:type="dxa"/>
+          </w:tcPr>
+          <w:p>
+            <w:pPr>
+              <w:pStyle w:val="Code"/>
+            </w:pPr>
+            <w:r>
+              <w:t>A GT4500 inicializálása 0 torpedóval a primary és a secondary-ben is-is.</w:t>
+            </w:r>
+          </w:p>
+        </w:tc>
+      </w:tr>
+      <w:tr>
+        <w:tc>
+          <w:tcPr>
+            <w:tcW w:w="4606" w:type="dxa"/>
+          </w:tcPr>
+          <w:p>
+            <w:pPr>
+              <w:pStyle w:val="Code"/>
+            </w:pPr>
+            <w:r>
+              <w:t>Előfeltételek</w:t>
+            </w:r>
+          </w:p>
+        </w:tc>
+        <w:tc>
+          <w:tcPr>
+            <w:tcW w:w="4606" w:type="dxa"/>
+          </w:tcPr>
+          <w:p>
+            <w:pPr>
+              <w:pStyle w:val="Code"/>
+            </w:pPr>
+            <w:r>
+              <w:t>A GT4500 osztály példányában nincsen torpedó, se az primary, se a secondary bayben.</w:t>
+            </w:r>
+          </w:p>
+        </w:tc>
+      </w:tr>
+      <w:tr>
+        <w:tc>
+          <w:tcPr>
+            <w:tcW w:w="4606" w:type="dxa"/>
+          </w:tcPr>
+          <w:p>
+            <w:pPr>
+              <w:pStyle w:val="Code"/>
+            </w:pPr>
+            <w:r>
+              <w:t>A teszt lépései</w:t>
+            </w:r>
+          </w:p>
+        </w:tc>
+        <w:tc>
+          <w:tcPr>
+            <w:tcW w:w="4606" w:type="dxa"/>
+          </w:tcPr>
+          <w:p>
+            <w:pPr>
+              <w:pStyle w:val="Code"/>
+            </w:pPr>
+            <w:r>
+              <w:t>fireTorpedo(…) meghívása SINGLE módban.</w:t>
+            </w:r>
+          </w:p>
+        </w:tc>
+      </w:tr>
+      <w:tr>
+        <w:tc>
+          <w:tcPr>
+            <w:tcW w:w="4606" w:type="dxa"/>
+          </w:tcPr>
+          <w:p>
+            <w:pPr>
+              <w:pStyle w:val="Code"/>
+            </w:pPr>
+            <w:r>
+              <w:t>Elvárt kimenet</w:t>
+            </w:r>
+          </w:p>
+        </w:tc>
+        <w:tc>
+          <w:tcPr>
+            <w:tcW w:w="4606" w:type="dxa"/>
+          </w:tcPr>
+          <w:p>
+            <w:pPr>
+              <w:pStyle w:val="Code"/>
+            </w:pPr>
+            <w:r>
+              <w:t>FAIL</w:t>
+            </w:r>
+          </w:p>
+        </w:tc>
+      </w:tr>
+    </w:tbl>
     <w:p>
       <w:pPr>
         <w:pStyle w:val="Code"/>
       </w:pPr>
+      <w:r>
+        <w:t>Ezt a tesztet azért választottuk, ohgy teszteljük, hogy nem történik-e hamis tüzelés, hogyha a primary és a secondary is-is üres.</w:t>
+      </w:r>
     </w:p>
     <w:p>
       <w:pPr>
@@ -570,6 +720,7 @@
         <w:pStyle w:val="Cmsor1"/>
       </w:pPr>
       <w:r>
+        <w:lastRenderedPageBreak/>
         <w:t xml:space="preserve">Feladat: </w:t>
       </w:r>
     </w:p>
@@ -603,7 +754,6 @@
         <w:pStyle w:val="Cmsor1"/>
       </w:pPr>
       <w:r>
-        <w:lastRenderedPageBreak/>
         <w:t xml:space="preserve">Feladat: </w:t>
       </w:r>
     </w:p>
@@ -641,7 +791,7 @@
 </file>
 
 <file path=word/endnotes.xml><?xml version="1.0" encoding="utf-8"?>
-<w:endnotes xmlns:wpc="http://schemas.microsoft.com/office/word/2010/wordprocessingCanvas" xmlns:cx="http://schemas.microsoft.com/office/drawing/2014/chartex" xmlns:cx1="http://schemas.microsoft.com/office/drawing/2015/9/8/chartex" xmlns:cx2="http://schemas.microsoft.com/office/drawing/2015/10/21/chartex" xmlns:cx3="http://schemas.microsoft.com/office/drawing/2016/5/9/chartex" xmlns:cx4="http://schemas.microsoft.com/office/drawing/2016/5/10/chartex" xmlns:cx5="http://schemas.microsoft.com/office/drawing/2016/5/11/chartex" xmlns:cx6="http://schemas.microsoft.com/office/drawing/2016/5/12/chartex" xmlns:cx7="http://schemas.microsoft.com/office/drawing/2016/5/13/chartex" xmlns:cx8="http://schemas.microsoft.com/office/drawing/2016/5/14/chartex" xmlns:mc="http://schemas.openxmlformats.org/markup-compatibility/2006" xmlns:aink="http://schemas.microsoft.com/office/drawing/2016/ink" xmlns:am3d="http://schemas.microsoft.com/office/drawing/2017/model3d" xmlns:o="urn:schemas-microsoft-com:office:office" xmlns:oel="http://schemas.microsoft.com/office/2019/extlst" xmlns:r="http://schemas.openxmlformats.org/officeDocument/2006/relationships" xmlns:m="http://schemas.openxmlformats.org/officeDocument/2006/math" xmlns:v="urn:schemas-microsoft-com:vml" xmlns:wp14="http://schemas.microsoft.com/office/word/2010/wordprocessingDrawing" xmlns:wp="http://schemas.openxmlformats.org/drawingml/2006/wordprocessingDrawing" xmlns:w10="urn:schemas-microsoft-com:office:word" xmlns:w="http://schemas.openxmlformats.org/wordprocessingml/2006/main" xmlns:w14="http://schemas.microsoft.com/office/word/2010/wordml" xmlns:w15="http://schemas.microsoft.com/office/word/2012/wordml" xmlns:w16cex="http://schemas.microsoft.com/office/word/2018/wordml/cex" xmlns:w16cid="http://schemas.microsoft.com/office/word/2016/wordml/cid" xmlns:w16="http://schemas.microsoft.com/office/word/2018/wordml" xmlns:w16du="http://schemas.microsoft.com/office/word/2023/wordml/word16du" xmlns:w16sdtdh="http://schemas.microsoft.com/office/word/2020/wordml/sdtdatahash" xmlns:w16sdtfl="http://schemas.microsoft.com/office/word/2024/wordml/sdtformatlock" xmlns:w16se="http://schemas.microsoft.com/office/word/2015/wordml/symex" xmlns:wpg="http://schemas.microsoft.com/office/word/2010/wordprocessingGroup" xmlns:wpi="http://schemas.microsoft.com/office/word/2010/wordprocessingInk" xmlns:wne="http://schemas.microsoft.com/office/word/2006/wordml" xmlns:wps="http://schemas.microsoft.com/office/word/2010/wordprocessingShape" mc:Ignorable="w14 w15 w16se w16cid w16 w16cex w16sdtdh w16sdtfl w16du wp14">
+<w:endnotes xmlns:wpc="http://schemas.microsoft.com/office/word/2010/wordprocessingCanvas" xmlns:cx="http://schemas.microsoft.com/office/drawing/2014/chartex" xmlns:cx1="http://schemas.microsoft.com/office/drawing/2015/9/8/chartex" xmlns:cx2="http://schemas.microsoft.com/office/drawing/2015/10/21/chartex" xmlns:cx3="http://schemas.microsoft.com/office/drawing/2016/5/9/chartex" xmlns:cx4="http://schemas.microsoft.com/office/drawing/2016/5/10/chartex" xmlns:cx5="http://schemas.microsoft.com/office/drawing/2016/5/11/chartex" xmlns:cx6="http://schemas.microsoft.com/office/drawing/2016/5/12/chartex" xmlns:cx7="http://schemas.microsoft.com/office/drawing/2016/5/13/chartex" xmlns:cx8="http://schemas.microsoft.com/office/drawing/2016/5/14/chartex" xmlns:mc="http://schemas.openxmlformats.org/markup-compatibility/2006" xmlns:aink="http://schemas.microsoft.com/office/drawing/2016/ink" xmlns:am3d="http://schemas.microsoft.com/office/drawing/2017/model3d" xmlns:o="urn:schemas-microsoft-com:office:office" xmlns:oel="http://schemas.microsoft.com/office/2019/extlst" xmlns:r="http://schemas.openxmlformats.org/officeDocument/2006/relationships" xmlns:m="http://schemas.openxmlformats.org/officeDocument/2006/math" xmlns:v="urn:schemas-microsoft-com:vml" xmlns:wp14="http://schemas.microsoft.com/office/word/2010/wordprocessingDrawing" xmlns:wp="http://schemas.openxmlformats.org/drawingml/2006/wordprocessingDrawing" xmlns:w10="urn:schemas-microsoft-com:office:word" xmlns:w="http://schemas.openxmlformats.org/wordprocessingml/2006/main" xmlns:w14="http://schemas.microsoft.com/office/word/2010/wordml" xmlns:w15="http://schemas.microsoft.com/office/word/2012/wordml" xmlns:w16cex="http://schemas.microsoft.com/office/word/2018/wordml/cex" xmlns:w16cid="http://schemas.microsoft.com/office/word/2016/wordml/cid" xmlns:w16="http://schemas.microsoft.com/office/word/2018/wordml" xmlns:w16sdtdh="http://schemas.microsoft.com/office/word/2020/wordml/sdtdatahash" xmlns:w16se="http://schemas.microsoft.com/office/word/2015/wordml/symex" xmlns:wpg="http://schemas.microsoft.com/office/word/2010/wordprocessingGroup" xmlns:wpi="http://schemas.microsoft.com/office/word/2010/wordprocessingInk" xmlns:wne="http://schemas.microsoft.com/office/word/2006/wordml" xmlns:wps="http://schemas.microsoft.com/office/word/2010/wordprocessingShape" mc:Ignorable="w14 w15 w16se w16cid w16 w16cex w16sdtdh wp14">
   <w:endnote w:type="separator" w:id="-1">
     <w:p>
       <w:pPr>
@@ -666,7 +816,7 @@
 </file>
 
 <file path=word/footer1.xml><?xml version="1.0" encoding="utf-8"?>
-<w:ftr xmlns:wpc="http://schemas.microsoft.com/office/word/2010/wordprocessingCanvas" xmlns:cx="http://schemas.microsoft.com/office/drawing/2014/chartex" xmlns:cx1="http://schemas.microsoft.com/office/drawing/2015/9/8/chartex" xmlns:cx2="http://schemas.microsoft.com/office/drawing/2015/10/21/chartex" xmlns:cx3="http://schemas.microsoft.com/office/drawing/2016/5/9/chartex" xmlns:cx4="http://schemas.microsoft.com/office/drawing/2016/5/10/chartex" xmlns:cx5="http://schemas.microsoft.com/office/drawing/2016/5/11/chartex" xmlns:cx6="http://schemas.microsoft.com/office/drawing/2016/5/12/chartex" xmlns:cx7="http://schemas.microsoft.com/office/drawing/2016/5/13/chartex" xmlns:cx8="http://schemas.microsoft.com/office/drawing/2016/5/14/chartex" xmlns:mc="http://schemas.openxmlformats.org/markup-compatibility/2006" xmlns:aink="http://schemas.microsoft.com/office/drawing/2016/ink" xmlns:am3d="http://schemas.microsoft.com/office/drawing/2017/model3d" xmlns:o="urn:schemas-microsoft-com:office:office" xmlns:oel="http://schemas.microsoft.com/office/2019/extlst" xmlns:r="http://schemas.openxmlformats.org/officeDocument/2006/relationships" xmlns:m="http://schemas.openxmlformats.org/officeDocument/2006/math" xmlns:v="urn:schemas-microsoft-com:vml" xmlns:wp14="http://schemas.microsoft.com/office/word/2010/wordprocessingDrawing" xmlns:wp="http://schemas.openxmlformats.org/drawingml/2006/wordprocessingDrawing" xmlns:w10="urn:schemas-microsoft-com:office:word" xmlns:w="http://schemas.openxmlformats.org/wordprocessingml/2006/main" xmlns:w14="http://schemas.microsoft.com/office/word/2010/wordml" xmlns:w15="http://schemas.microsoft.com/office/word/2012/wordml" xmlns:w16cex="http://schemas.microsoft.com/office/word/2018/wordml/cex" xmlns:w16cid="http://schemas.microsoft.com/office/word/2016/wordml/cid" xmlns:w16="http://schemas.microsoft.com/office/word/2018/wordml" xmlns:w16du="http://schemas.microsoft.com/office/word/2023/wordml/word16du" xmlns:w16sdtdh="http://schemas.microsoft.com/office/word/2020/wordml/sdtdatahash" xmlns:w16sdtfl="http://schemas.microsoft.com/office/word/2024/wordml/sdtformatlock" xmlns:w16se="http://schemas.microsoft.com/office/word/2015/wordml/symex" xmlns:wpg="http://schemas.microsoft.com/office/word/2010/wordprocessingGroup" xmlns:wpi="http://schemas.microsoft.com/office/word/2010/wordprocessingInk" xmlns:wne="http://schemas.microsoft.com/office/word/2006/wordml" xmlns:wps="http://schemas.microsoft.com/office/word/2010/wordprocessingShape" mc:Ignorable="w14 w15 w16se w16cid w16 w16cex w16sdtdh w16sdtfl w16du wp14">
+<w:ftr xmlns:wpc="http://schemas.microsoft.com/office/word/2010/wordprocessingCanvas" xmlns:cx="http://schemas.microsoft.com/office/drawing/2014/chartex" xmlns:cx1="http://schemas.microsoft.com/office/drawing/2015/9/8/chartex" xmlns:cx2="http://schemas.microsoft.com/office/drawing/2015/10/21/chartex" xmlns:cx3="http://schemas.microsoft.com/office/drawing/2016/5/9/chartex" xmlns:cx4="http://schemas.microsoft.com/office/drawing/2016/5/10/chartex" xmlns:cx5="http://schemas.microsoft.com/office/drawing/2016/5/11/chartex" xmlns:cx6="http://schemas.microsoft.com/office/drawing/2016/5/12/chartex" xmlns:cx7="http://schemas.microsoft.com/office/drawing/2016/5/13/chartex" xmlns:cx8="http://schemas.microsoft.com/office/drawing/2016/5/14/chartex" xmlns:mc="http://schemas.openxmlformats.org/markup-compatibility/2006" xmlns:aink="http://schemas.microsoft.com/office/drawing/2016/ink" xmlns:am3d="http://schemas.microsoft.com/office/drawing/2017/model3d" xmlns:o="urn:schemas-microsoft-com:office:office" xmlns:oel="http://schemas.microsoft.com/office/2019/extlst" xmlns:r="http://schemas.openxmlformats.org/officeDocument/2006/relationships" xmlns:m="http://schemas.openxmlformats.org/officeDocument/2006/math" xmlns:v="urn:schemas-microsoft-com:vml" xmlns:wp14="http://schemas.microsoft.com/office/word/2010/wordprocessingDrawing" xmlns:wp="http://schemas.openxmlformats.org/drawingml/2006/wordprocessingDrawing" xmlns:w10="urn:schemas-microsoft-com:office:word" xmlns:w="http://schemas.openxmlformats.org/wordprocessingml/2006/main" xmlns:w14="http://schemas.microsoft.com/office/word/2010/wordml" xmlns:w15="http://schemas.microsoft.com/office/word/2012/wordml" xmlns:w16cex="http://schemas.microsoft.com/office/word/2018/wordml/cex" xmlns:w16cid="http://schemas.microsoft.com/office/word/2016/wordml/cid" xmlns:w16="http://schemas.microsoft.com/office/word/2018/wordml" xmlns:w16sdtdh="http://schemas.microsoft.com/office/word/2020/wordml/sdtdatahash" xmlns:w16se="http://schemas.microsoft.com/office/word/2015/wordml/symex" xmlns:wpg="http://schemas.microsoft.com/office/word/2010/wordprocessingGroup" xmlns:wpi="http://schemas.microsoft.com/office/word/2010/wordprocessingInk" xmlns:wne="http://schemas.microsoft.com/office/word/2006/wordml" xmlns:wps="http://schemas.microsoft.com/office/word/2010/wordprocessingShape" mc:Ignorable="w14 w15 w16se w16cid w16 w16cex w16sdtdh wp14">
   <w:sdt>
     <w:sdtPr>
       <w:id w:val="2086258187"/>
@@ -723,7 +873,7 @@
 </file>
 
 <file path=word/footer2.xml><?xml version="1.0" encoding="utf-8"?>
-<w:ftr xmlns:wpc="http://schemas.microsoft.com/office/word/2010/wordprocessingCanvas" xmlns:cx="http://schemas.microsoft.com/office/drawing/2014/chartex" xmlns:cx1="http://schemas.microsoft.com/office/drawing/2015/9/8/chartex" xmlns:cx2="http://schemas.microsoft.com/office/drawing/2015/10/21/chartex" xmlns:cx3="http://schemas.microsoft.com/office/drawing/2016/5/9/chartex" xmlns:cx4="http://schemas.microsoft.com/office/drawing/2016/5/10/chartex" xmlns:cx5="http://schemas.microsoft.com/office/drawing/2016/5/11/chartex" xmlns:cx6="http://schemas.microsoft.com/office/drawing/2016/5/12/chartex" xmlns:cx7="http://schemas.microsoft.com/office/drawing/2016/5/13/chartex" xmlns:cx8="http://schemas.microsoft.com/office/drawing/2016/5/14/chartex" xmlns:mc="http://schemas.openxmlformats.org/markup-compatibility/2006" xmlns:aink="http://schemas.microsoft.com/office/drawing/2016/ink" xmlns:am3d="http://schemas.microsoft.com/office/drawing/2017/model3d" xmlns:o="urn:schemas-microsoft-com:office:office" xmlns:oel="http://schemas.microsoft.com/office/2019/extlst" xmlns:r="http://schemas.openxmlformats.org/officeDocument/2006/relationships" xmlns:m="http://schemas.openxmlformats.org/officeDocument/2006/math" xmlns:v="urn:schemas-microsoft-com:vml" xmlns:wp14="http://schemas.microsoft.com/office/word/2010/wordprocessingDrawing" xmlns:wp="http://schemas.openxmlformats.org/drawingml/2006/wordprocessingDrawing" xmlns:w10="urn:schemas-microsoft-com:office:word" xmlns:w="http://schemas.openxmlformats.org/wordprocessingml/2006/main" xmlns:w14="http://schemas.microsoft.com/office/word/2010/wordml" xmlns:w15="http://schemas.microsoft.com/office/word/2012/wordml" xmlns:w16cex="http://schemas.microsoft.com/office/word/2018/wordml/cex" xmlns:w16cid="http://schemas.microsoft.com/office/word/2016/wordml/cid" xmlns:w16="http://schemas.microsoft.com/office/word/2018/wordml" xmlns:w16du="http://schemas.microsoft.com/office/word/2023/wordml/word16du" xmlns:w16sdtdh="http://schemas.microsoft.com/office/word/2020/wordml/sdtdatahash" xmlns:w16sdtfl="http://schemas.microsoft.com/office/word/2024/wordml/sdtformatlock" xmlns:w16se="http://schemas.microsoft.com/office/word/2015/wordml/symex" xmlns:wpg="http://schemas.microsoft.com/office/word/2010/wordprocessingGroup" xmlns:wpi="http://schemas.microsoft.com/office/word/2010/wordprocessingInk" xmlns:wne="http://schemas.microsoft.com/office/word/2006/wordml" xmlns:wps="http://schemas.microsoft.com/office/word/2010/wordprocessingShape" mc:Ignorable="w14 w15 w16se w16cid w16 w16cex w16sdtdh w16sdtfl w16du wp14">
+<w:ftr xmlns:wpc="http://schemas.microsoft.com/office/word/2010/wordprocessingCanvas" xmlns:cx="http://schemas.microsoft.com/office/drawing/2014/chartex" xmlns:cx1="http://schemas.microsoft.com/office/drawing/2015/9/8/chartex" xmlns:cx2="http://schemas.microsoft.com/office/drawing/2015/10/21/chartex" xmlns:cx3="http://schemas.microsoft.com/office/drawing/2016/5/9/chartex" xmlns:cx4="http://schemas.microsoft.com/office/drawing/2016/5/10/chartex" xmlns:cx5="http://schemas.microsoft.com/office/drawing/2016/5/11/chartex" xmlns:cx6="http://schemas.microsoft.com/office/drawing/2016/5/12/chartex" xmlns:cx7="http://schemas.microsoft.com/office/drawing/2016/5/13/chartex" xmlns:cx8="http://schemas.microsoft.com/office/drawing/2016/5/14/chartex" xmlns:mc="http://schemas.openxmlformats.org/markup-compatibility/2006" xmlns:aink="http://schemas.microsoft.com/office/drawing/2016/ink" xmlns:am3d="http://schemas.microsoft.com/office/drawing/2017/model3d" xmlns:o="urn:schemas-microsoft-com:office:office" xmlns:oel="http://schemas.microsoft.com/office/2019/extlst" xmlns:r="http://schemas.openxmlformats.org/officeDocument/2006/relationships" xmlns:m="http://schemas.openxmlformats.org/officeDocument/2006/math" xmlns:v="urn:schemas-microsoft-com:vml" xmlns:wp14="http://schemas.microsoft.com/office/word/2010/wordprocessingDrawing" xmlns:wp="http://schemas.openxmlformats.org/drawingml/2006/wordprocessingDrawing" xmlns:w10="urn:schemas-microsoft-com:office:word" xmlns:w="http://schemas.openxmlformats.org/wordprocessingml/2006/main" xmlns:w14="http://schemas.microsoft.com/office/word/2010/wordml" xmlns:w15="http://schemas.microsoft.com/office/word/2012/wordml" xmlns:w16cex="http://schemas.microsoft.com/office/word/2018/wordml/cex" xmlns:w16cid="http://schemas.microsoft.com/office/word/2016/wordml/cid" xmlns:w16="http://schemas.microsoft.com/office/word/2018/wordml" xmlns:w16sdtdh="http://schemas.microsoft.com/office/word/2020/wordml/sdtdatahash" xmlns:w16se="http://schemas.microsoft.com/office/word/2015/wordml/symex" xmlns:wpg="http://schemas.microsoft.com/office/word/2010/wordprocessingGroup" xmlns:wpi="http://schemas.microsoft.com/office/word/2010/wordprocessingInk" xmlns:wne="http://schemas.microsoft.com/office/word/2006/wordml" xmlns:wps="http://schemas.microsoft.com/office/word/2010/wordprocessingShape" mc:Ignorable="w14 w15 w16se w16cid w16 w16cex w16sdtdh wp14">
   <w:tbl>
     <w:tblPr>
       <w:tblW w:w="0" w:type="auto"/>
@@ -794,7 +944,7 @@
 </file>
 
 <file path=word/footnotes.xml><?xml version="1.0" encoding="utf-8"?>
-<w:footnotes xmlns:wpc="http://schemas.microsoft.com/office/word/2010/wordprocessingCanvas" xmlns:cx="http://schemas.microsoft.com/office/drawing/2014/chartex" xmlns:cx1="http://schemas.microsoft.com/office/drawing/2015/9/8/chartex" xmlns:cx2="http://schemas.microsoft.com/office/drawing/2015/10/21/chartex" xmlns:cx3="http://schemas.microsoft.com/office/drawing/2016/5/9/chartex" xmlns:cx4="http://schemas.microsoft.com/office/drawing/2016/5/10/chartex" xmlns:cx5="http://schemas.microsoft.com/office/drawing/2016/5/11/chartex" xmlns:cx6="http://schemas.microsoft.com/office/drawing/2016/5/12/chartex" xmlns:cx7="http://schemas.microsoft.com/office/drawing/2016/5/13/chartex" xmlns:cx8="http://schemas.microsoft.com/office/drawing/2016/5/14/chartex" xmlns:mc="http://schemas.openxmlformats.org/markup-compatibility/2006" xmlns:aink="http://schemas.microsoft.com/office/drawing/2016/ink" xmlns:am3d="http://schemas.microsoft.com/office/drawing/2017/model3d" xmlns:o="urn:schemas-microsoft-com:office:office" xmlns:oel="http://schemas.microsoft.com/office/2019/extlst" xmlns:r="http://schemas.openxmlformats.org/officeDocument/2006/relationships" xmlns:m="http://schemas.openxmlformats.org/officeDocument/2006/math" xmlns:v="urn:schemas-microsoft-com:vml" xmlns:wp14="http://schemas.microsoft.com/office/word/2010/wordprocessingDrawing" xmlns:wp="http://schemas.openxmlformats.org/drawingml/2006/wordprocessingDrawing" xmlns:w10="urn:schemas-microsoft-com:office:word" xmlns:w="http://schemas.openxmlformats.org/wordprocessingml/2006/main" xmlns:w14="http://schemas.microsoft.com/office/word/2010/wordml" xmlns:w15="http://schemas.microsoft.com/office/word/2012/wordml" xmlns:w16cex="http://schemas.microsoft.com/office/word/2018/wordml/cex" xmlns:w16cid="http://schemas.microsoft.com/office/word/2016/wordml/cid" xmlns:w16="http://schemas.microsoft.com/office/word/2018/wordml" xmlns:w16du="http://schemas.microsoft.com/office/word/2023/wordml/word16du" xmlns:w16sdtdh="http://schemas.microsoft.com/office/word/2020/wordml/sdtdatahash" xmlns:w16sdtfl="http://schemas.microsoft.com/office/word/2024/wordml/sdtformatlock" xmlns:w16se="http://schemas.microsoft.com/office/word/2015/wordml/symex" xmlns:wpg="http://schemas.microsoft.com/office/word/2010/wordprocessingGroup" xmlns:wpi="http://schemas.microsoft.com/office/word/2010/wordprocessingInk" xmlns:wne="http://schemas.microsoft.com/office/word/2006/wordml" xmlns:wps="http://schemas.microsoft.com/office/word/2010/wordprocessingShape" mc:Ignorable="w14 w15 w16se w16cid w16 w16cex w16sdtdh w16sdtfl w16du wp14">
+<w:footnotes xmlns:wpc="http://schemas.microsoft.com/office/word/2010/wordprocessingCanvas" xmlns:cx="http://schemas.microsoft.com/office/drawing/2014/chartex" xmlns:cx1="http://schemas.microsoft.com/office/drawing/2015/9/8/chartex" xmlns:cx2="http://schemas.microsoft.com/office/drawing/2015/10/21/chartex" xmlns:cx3="http://schemas.microsoft.com/office/drawing/2016/5/9/chartex" xmlns:cx4="http://schemas.microsoft.com/office/drawing/2016/5/10/chartex" xmlns:cx5="http://schemas.microsoft.com/office/drawing/2016/5/11/chartex" xmlns:cx6="http://schemas.microsoft.com/office/drawing/2016/5/12/chartex" xmlns:cx7="http://schemas.microsoft.com/office/drawing/2016/5/13/chartex" xmlns:cx8="http://schemas.microsoft.com/office/drawing/2016/5/14/chartex" xmlns:mc="http://schemas.openxmlformats.org/markup-compatibility/2006" xmlns:aink="http://schemas.microsoft.com/office/drawing/2016/ink" xmlns:am3d="http://schemas.microsoft.com/office/drawing/2017/model3d" xmlns:o="urn:schemas-microsoft-com:office:office" xmlns:oel="http://schemas.microsoft.com/office/2019/extlst" xmlns:r="http://schemas.openxmlformats.org/officeDocument/2006/relationships" xmlns:m="http://schemas.openxmlformats.org/officeDocument/2006/math" xmlns:v="urn:schemas-microsoft-com:vml" xmlns:wp14="http://schemas.microsoft.com/office/word/2010/wordprocessingDrawing" xmlns:wp="http://schemas.openxmlformats.org/drawingml/2006/wordprocessingDrawing" xmlns:w10="urn:schemas-microsoft-com:office:word" xmlns:w="http://schemas.openxmlformats.org/wordprocessingml/2006/main" xmlns:w14="http://schemas.microsoft.com/office/word/2010/wordml" xmlns:w15="http://schemas.microsoft.com/office/word/2012/wordml" xmlns:w16cex="http://schemas.microsoft.com/office/word/2018/wordml/cex" xmlns:w16cid="http://schemas.microsoft.com/office/word/2016/wordml/cid" xmlns:w16="http://schemas.microsoft.com/office/word/2018/wordml" xmlns:w16sdtdh="http://schemas.microsoft.com/office/word/2020/wordml/sdtdatahash" xmlns:w16se="http://schemas.microsoft.com/office/word/2015/wordml/symex" xmlns:wpg="http://schemas.microsoft.com/office/word/2010/wordprocessingGroup" xmlns:wpi="http://schemas.microsoft.com/office/word/2010/wordprocessingInk" xmlns:wne="http://schemas.microsoft.com/office/word/2006/wordml" xmlns:wps="http://schemas.microsoft.com/office/word/2010/wordprocessingShape" mc:Ignorable="w14 w15 w16se w16cid w16 w16cex w16sdtdh wp14">
   <w:footnote w:type="separator" w:id="-1">
     <w:p>
       <w:pPr>
@@ -819,7 +969,7 @@
 </file>
 
 <file path=word/header1.xml><?xml version="1.0" encoding="utf-8"?>
-<w:hdr xmlns:wpc="http://schemas.microsoft.com/office/word/2010/wordprocessingCanvas" xmlns:cx="http://schemas.microsoft.com/office/drawing/2014/chartex" xmlns:cx1="http://schemas.microsoft.com/office/drawing/2015/9/8/chartex" xmlns:cx2="http://schemas.microsoft.com/office/drawing/2015/10/21/chartex" xmlns:cx3="http://schemas.microsoft.com/office/drawing/2016/5/9/chartex" xmlns:cx4="http://schemas.microsoft.com/office/drawing/2016/5/10/chartex" xmlns:cx5="http://schemas.microsoft.com/office/drawing/2016/5/11/chartex" xmlns:cx6="http://schemas.microsoft.com/office/drawing/2016/5/12/chartex" xmlns:cx7="http://schemas.microsoft.com/office/drawing/2016/5/13/chartex" xmlns:cx8="http://schemas.microsoft.com/office/drawing/2016/5/14/chartex" xmlns:mc="http://schemas.openxmlformats.org/markup-compatibility/2006" xmlns:aink="http://schemas.microsoft.com/office/drawing/2016/ink" xmlns:am3d="http://schemas.microsoft.com/office/drawing/2017/model3d" xmlns:o="urn:schemas-microsoft-com:office:office" xmlns:oel="http://schemas.microsoft.com/office/2019/extlst" xmlns:r="http://schemas.openxmlformats.org/officeDocument/2006/relationships" xmlns:m="http://schemas.openxmlformats.org/officeDocument/2006/math" xmlns:v="urn:schemas-microsoft-com:vml" xmlns:wp14="http://schemas.microsoft.com/office/word/2010/wordprocessingDrawing" xmlns:wp="http://schemas.openxmlformats.org/drawingml/2006/wordprocessingDrawing" xmlns:w10="urn:schemas-microsoft-com:office:word" xmlns:w="http://schemas.openxmlformats.org/wordprocessingml/2006/main" xmlns:w14="http://schemas.microsoft.com/office/word/2010/wordml" xmlns:w15="http://schemas.microsoft.com/office/word/2012/wordml" xmlns:w16cex="http://schemas.microsoft.com/office/word/2018/wordml/cex" xmlns:w16cid="http://schemas.microsoft.com/office/word/2016/wordml/cid" xmlns:w16="http://schemas.microsoft.com/office/word/2018/wordml" xmlns:w16du="http://schemas.microsoft.com/office/word/2023/wordml/word16du" xmlns:w16sdtdh="http://schemas.microsoft.com/office/word/2020/wordml/sdtdatahash" xmlns:w16sdtfl="http://schemas.microsoft.com/office/word/2024/wordml/sdtformatlock" xmlns:w16se="http://schemas.microsoft.com/office/word/2015/wordml/symex" xmlns:wpg="http://schemas.microsoft.com/office/word/2010/wordprocessingGroup" xmlns:wpi="http://schemas.microsoft.com/office/word/2010/wordprocessingInk" xmlns:wne="http://schemas.microsoft.com/office/word/2006/wordml" xmlns:wps="http://schemas.microsoft.com/office/word/2010/wordprocessingShape" mc:Ignorable="w14 w15 w16se w16cid w16 w16cex w16sdtdh w16sdtfl w16du wp14">
+<w:hdr xmlns:wpc="http://schemas.microsoft.com/office/word/2010/wordprocessingCanvas" xmlns:cx="http://schemas.microsoft.com/office/drawing/2014/chartex" xmlns:cx1="http://schemas.microsoft.com/office/drawing/2015/9/8/chartex" xmlns:cx2="http://schemas.microsoft.com/office/drawing/2015/10/21/chartex" xmlns:cx3="http://schemas.microsoft.com/office/drawing/2016/5/9/chartex" xmlns:cx4="http://schemas.microsoft.com/office/drawing/2016/5/10/chartex" xmlns:cx5="http://schemas.microsoft.com/office/drawing/2016/5/11/chartex" xmlns:cx6="http://schemas.microsoft.com/office/drawing/2016/5/12/chartex" xmlns:cx7="http://schemas.microsoft.com/office/drawing/2016/5/13/chartex" xmlns:cx8="http://schemas.microsoft.com/office/drawing/2016/5/14/chartex" xmlns:mc="http://schemas.openxmlformats.org/markup-compatibility/2006" xmlns:aink="http://schemas.microsoft.com/office/drawing/2016/ink" xmlns:am3d="http://schemas.microsoft.com/office/drawing/2017/model3d" xmlns:o="urn:schemas-microsoft-com:office:office" xmlns:oel="http://schemas.microsoft.com/office/2019/extlst" xmlns:r="http://schemas.openxmlformats.org/officeDocument/2006/relationships" xmlns:m="http://schemas.openxmlformats.org/officeDocument/2006/math" xmlns:v="urn:schemas-microsoft-com:vml" xmlns:wp14="http://schemas.microsoft.com/office/word/2010/wordprocessingDrawing" xmlns:wp="http://schemas.openxmlformats.org/drawingml/2006/wordprocessingDrawing" xmlns:w10="urn:schemas-microsoft-com:office:word" xmlns:w="http://schemas.openxmlformats.org/wordprocessingml/2006/main" xmlns:w14="http://schemas.microsoft.com/office/word/2010/wordml" xmlns:w15="http://schemas.microsoft.com/office/word/2012/wordml" xmlns:w16cex="http://schemas.microsoft.com/office/word/2018/wordml/cex" xmlns:w16cid="http://schemas.microsoft.com/office/word/2016/wordml/cid" xmlns:w16="http://schemas.microsoft.com/office/word/2018/wordml" xmlns:w16sdtdh="http://schemas.microsoft.com/office/word/2020/wordml/sdtdatahash" xmlns:w16se="http://schemas.microsoft.com/office/word/2015/wordml/symex" xmlns:wpg="http://schemas.microsoft.com/office/word/2010/wordprocessingGroup" xmlns:wpi="http://schemas.microsoft.com/office/word/2010/wordprocessingInk" xmlns:wne="http://schemas.microsoft.com/office/word/2006/wordml" xmlns:wps="http://schemas.microsoft.com/office/word/2010/wordprocessingShape" mc:Ignorable="w14 w15 w16se w16cid w16 w16cex w16sdtdh wp14">
   <w:p>
     <w:pPr>
       <w:pStyle w:val="lfej"/>
@@ -1003,7 +1153,7 @@
 </file>
 
 <file path=word/header2.xml><?xml version="1.0" encoding="utf-8"?>
-<w:hdr xmlns:wpc="http://schemas.microsoft.com/office/word/2010/wordprocessingCanvas" xmlns:cx="http://schemas.microsoft.com/office/drawing/2014/chartex" xmlns:cx1="http://schemas.microsoft.com/office/drawing/2015/9/8/chartex" xmlns:cx2="http://schemas.microsoft.com/office/drawing/2015/10/21/chartex" xmlns:cx3="http://schemas.microsoft.com/office/drawing/2016/5/9/chartex" xmlns:cx4="http://schemas.microsoft.com/office/drawing/2016/5/10/chartex" xmlns:cx5="http://schemas.microsoft.com/office/drawing/2016/5/11/chartex" xmlns:cx6="http://schemas.microsoft.com/office/drawing/2016/5/12/chartex" xmlns:cx7="http://schemas.microsoft.com/office/drawing/2016/5/13/chartex" xmlns:cx8="http://schemas.microsoft.com/office/drawing/2016/5/14/chartex" xmlns:mc="http://schemas.openxmlformats.org/markup-compatibility/2006" xmlns:aink="http://schemas.microsoft.com/office/drawing/2016/ink" xmlns:am3d="http://schemas.microsoft.com/office/drawing/2017/model3d" xmlns:o="urn:schemas-microsoft-com:office:office" xmlns:oel="http://schemas.microsoft.com/office/2019/extlst" xmlns:r="http://schemas.openxmlformats.org/officeDocument/2006/relationships" xmlns:m="http://schemas.openxmlformats.org/officeDocument/2006/math" xmlns:v="urn:schemas-microsoft-com:vml" xmlns:wp14="http://schemas.microsoft.com/office/word/2010/wordprocessingDrawing" xmlns:wp="http://schemas.openxmlformats.org/drawingml/2006/wordprocessingDrawing" xmlns:w10="urn:schemas-microsoft-com:office:word" xmlns:w="http://schemas.openxmlformats.org/wordprocessingml/2006/main" xmlns:w14="http://schemas.microsoft.com/office/word/2010/wordml" xmlns:w15="http://schemas.microsoft.com/office/word/2012/wordml" xmlns:w16cex="http://schemas.microsoft.com/office/word/2018/wordml/cex" xmlns:w16cid="http://schemas.microsoft.com/office/word/2016/wordml/cid" xmlns:w16="http://schemas.microsoft.com/office/word/2018/wordml" xmlns:w16du="http://schemas.microsoft.com/office/word/2023/wordml/word16du" xmlns:w16sdtdh="http://schemas.microsoft.com/office/word/2020/wordml/sdtdatahash" xmlns:w16sdtfl="http://schemas.microsoft.com/office/word/2024/wordml/sdtformatlock" xmlns:w16se="http://schemas.microsoft.com/office/word/2015/wordml/symex" xmlns:wpg="http://schemas.microsoft.com/office/word/2010/wordprocessingGroup" xmlns:wpi="http://schemas.microsoft.com/office/word/2010/wordprocessingInk" xmlns:wne="http://schemas.microsoft.com/office/word/2006/wordml" xmlns:wps="http://schemas.microsoft.com/office/word/2010/wordprocessingShape" mc:Ignorable="w14 w15 w16se w16cid w16 w16cex w16sdtdh w16sdtfl w16du wp14">
+<w:hdr xmlns:wpc="http://schemas.microsoft.com/office/word/2010/wordprocessingCanvas" xmlns:cx="http://schemas.microsoft.com/office/drawing/2014/chartex" xmlns:cx1="http://schemas.microsoft.com/office/drawing/2015/9/8/chartex" xmlns:cx2="http://schemas.microsoft.com/office/drawing/2015/10/21/chartex" xmlns:cx3="http://schemas.microsoft.com/office/drawing/2016/5/9/chartex" xmlns:cx4="http://schemas.microsoft.com/office/drawing/2016/5/10/chartex" xmlns:cx5="http://schemas.microsoft.com/office/drawing/2016/5/11/chartex" xmlns:cx6="http://schemas.microsoft.com/office/drawing/2016/5/12/chartex" xmlns:cx7="http://schemas.microsoft.com/office/drawing/2016/5/13/chartex" xmlns:cx8="http://schemas.microsoft.com/office/drawing/2016/5/14/chartex" xmlns:mc="http://schemas.openxmlformats.org/markup-compatibility/2006" xmlns:aink="http://schemas.microsoft.com/office/drawing/2016/ink" xmlns:am3d="http://schemas.microsoft.com/office/drawing/2017/model3d" xmlns:o="urn:schemas-microsoft-com:office:office" xmlns:oel="http://schemas.microsoft.com/office/2019/extlst" xmlns:r="http://schemas.openxmlformats.org/officeDocument/2006/relationships" xmlns:m="http://schemas.openxmlformats.org/officeDocument/2006/math" xmlns:v="urn:schemas-microsoft-com:vml" xmlns:wp14="http://schemas.microsoft.com/office/word/2010/wordprocessingDrawing" xmlns:wp="http://schemas.openxmlformats.org/drawingml/2006/wordprocessingDrawing" xmlns:w10="urn:schemas-microsoft-com:office:word" xmlns:w="http://schemas.openxmlformats.org/wordprocessingml/2006/main" xmlns:w14="http://schemas.microsoft.com/office/word/2010/wordml" xmlns:w15="http://schemas.microsoft.com/office/word/2012/wordml" xmlns:w16cex="http://schemas.microsoft.com/office/word/2018/wordml/cex" xmlns:w16cid="http://schemas.microsoft.com/office/word/2016/wordml/cid" xmlns:w16="http://schemas.microsoft.com/office/word/2018/wordml" xmlns:w16sdtdh="http://schemas.microsoft.com/office/word/2020/wordml/sdtdatahash" xmlns:w16se="http://schemas.microsoft.com/office/word/2015/wordml/symex" xmlns:wpg="http://schemas.microsoft.com/office/word/2010/wordprocessingGroup" xmlns:wpi="http://schemas.microsoft.com/office/word/2010/wordprocessingInk" xmlns:wne="http://schemas.microsoft.com/office/word/2006/wordml" xmlns:wps="http://schemas.microsoft.com/office/word/2010/wordprocessingShape" mc:Ignorable="w14 w15 w16se w16cid w16 w16cex w16sdtdh wp14">
   <w:tbl>
     <w:tblPr>
       <w:tblW w:w="0" w:type="auto"/>
@@ -1088,7 +1238,7 @@
 </file>
 
 <file path=word/numbering.xml><?xml version="1.0" encoding="utf-8"?>
-<w:numbering xmlns:wpc="http://schemas.microsoft.com/office/word/2010/wordprocessingCanvas" xmlns:cx="http://schemas.microsoft.com/office/drawing/2014/chartex" xmlns:cx1="http://schemas.microsoft.com/office/drawing/2015/9/8/chartex" xmlns:cx2="http://schemas.microsoft.com/office/drawing/2015/10/21/chartex" xmlns:cx3="http://schemas.microsoft.com/office/drawing/2016/5/9/chartex" xmlns:cx4="http://schemas.microsoft.com/office/drawing/2016/5/10/chartex" xmlns:cx5="http://schemas.microsoft.com/office/drawing/2016/5/11/chartex" xmlns:cx6="http://schemas.microsoft.com/office/drawing/2016/5/12/chartex" xmlns:cx7="http://schemas.microsoft.com/office/drawing/2016/5/13/chartex" xmlns:cx8="http://schemas.microsoft.com/office/drawing/2016/5/14/chartex" xmlns:mc="http://schemas.openxmlformats.org/markup-compatibility/2006" xmlns:aink="http://schemas.microsoft.com/office/drawing/2016/ink" xmlns:am3d="http://schemas.microsoft.com/office/drawing/2017/model3d" xmlns:o="urn:schemas-microsoft-com:office:office" xmlns:oel="http://schemas.microsoft.com/office/2019/extlst" xmlns:r="http://schemas.openxmlformats.org/officeDocument/2006/relationships" xmlns:m="http://schemas.openxmlformats.org/officeDocument/2006/math" xmlns:v="urn:schemas-microsoft-com:vml" xmlns:wp14="http://schemas.microsoft.com/office/word/2010/wordprocessingDrawing" xmlns:wp="http://schemas.openxmlformats.org/drawingml/2006/wordprocessingDrawing" xmlns:w10="urn:schemas-microsoft-com:office:word" xmlns:w="http://schemas.openxmlformats.org/wordprocessingml/2006/main" xmlns:w14="http://schemas.microsoft.com/office/word/2010/wordml" xmlns:w15="http://schemas.microsoft.com/office/word/2012/wordml" xmlns:w16cex="http://schemas.microsoft.com/office/word/2018/wordml/cex" xmlns:w16cid="http://schemas.microsoft.com/office/word/2016/wordml/cid" xmlns:w16="http://schemas.microsoft.com/office/word/2018/wordml" xmlns:w16du="http://schemas.microsoft.com/office/word/2023/wordml/word16du" xmlns:w16sdtdh="http://schemas.microsoft.com/office/word/2020/wordml/sdtdatahash" xmlns:w16sdtfl="http://schemas.microsoft.com/office/word/2024/wordml/sdtformatlock" xmlns:w16se="http://schemas.microsoft.com/office/word/2015/wordml/symex" xmlns:wpg="http://schemas.microsoft.com/office/word/2010/wordprocessingGroup" xmlns:wpi="http://schemas.microsoft.com/office/word/2010/wordprocessingInk" xmlns:wne="http://schemas.microsoft.com/office/word/2006/wordml" xmlns:wps="http://schemas.microsoft.com/office/word/2010/wordprocessingShape" mc:Ignorable="w14 w15 w16se w16cid w16 w16cex w16sdtdh w16sdtfl w16du wp14">
+<w:numbering xmlns:wpc="http://schemas.microsoft.com/office/word/2010/wordprocessingCanvas" xmlns:cx="http://schemas.microsoft.com/office/drawing/2014/chartex" xmlns:cx1="http://schemas.microsoft.com/office/drawing/2015/9/8/chartex" xmlns:cx2="http://schemas.microsoft.com/office/drawing/2015/10/21/chartex" xmlns:cx3="http://schemas.microsoft.com/office/drawing/2016/5/9/chartex" xmlns:cx4="http://schemas.microsoft.com/office/drawing/2016/5/10/chartex" xmlns:cx5="http://schemas.microsoft.com/office/drawing/2016/5/11/chartex" xmlns:cx6="http://schemas.microsoft.com/office/drawing/2016/5/12/chartex" xmlns:cx7="http://schemas.microsoft.com/office/drawing/2016/5/13/chartex" xmlns:cx8="http://schemas.microsoft.com/office/drawing/2016/5/14/chartex" xmlns:mc="http://schemas.openxmlformats.org/markup-compatibility/2006" xmlns:aink="http://schemas.microsoft.com/office/drawing/2016/ink" xmlns:am3d="http://schemas.microsoft.com/office/drawing/2017/model3d" xmlns:o="urn:schemas-microsoft-com:office:office" xmlns:oel="http://schemas.microsoft.com/office/2019/extlst" xmlns:r="http://schemas.openxmlformats.org/officeDocument/2006/relationships" xmlns:m="http://schemas.openxmlformats.org/officeDocument/2006/math" xmlns:v="urn:schemas-microsoft-com:vml" xmlns:wp14="http://schemas.microsoft.com/office/word/2010/wordprocessingDrawing" xmlns:wp="http://schemas.openxmlformats.org/drawingml/2006/wordprocessingDrawing" xmlns:w10="urn:schemas-microsoft-com:office:word" xmlns:w="http://schemas.openxmlformats.org/wordprocessingml/2006/main" xmlns:w14="http://schemas.microsoft.com/office/word/2010/wordml" xmlns:w15="http://schemas.microsoft.com/office/word/2012/wordml" xmlns:w16cex="http://schemas.microsoft.com/office/word/2018/wordml/cex" xmlns:w16cid="http://schemas.microsoft.com/office/word/2016/wordml/cid" xmlns:w16="http://schemas.microsoft.com/office/word/2018/wordml" xmlns:w16sdtdh="http://schemas.microsoft.com/office/word/2020/wordml/sdtdatahash" xmlns:w16se="http://schemas.microsoft.com/office/word/2015/wordml/symex" xmlns:wpg="http://schemas.microsoft.com/office/word/2010/wordprocessingGroup" xmlns:wpi="http://schemas.microsoft.com/office/word/2010/wordprocessingInk" xmlns:wne="http://schemas.microsoft.com/office/word/2006/wordml" xmlns:wps="http://schemas.microsoft.com/office/word/2010/wordprocessingShape" mc:Ignorable="w14 w15 w16se w16cid w16 w16cex w16sdtdh wp14">
   <w:abstractNum w:abstractNumId="0" w15:restartNumberingAfterBreak="0">
     <w:nsid w:val="0D8D12D7"/>
     <w:multiLevelType w:val="multilevel"/>
@@ -1890,7 +2040,7 @@
 </file>
 
 <file path=word/styles.xml><?xml version="1.0" encoding="utf-8"?>
-<w:styles xmlns:mc="http://schemas.openxmlformats.org/markup-compatibility/2006" xmlns:r="http://schemas.openxmlformats.org/officeDocument/2006/relationships" xmlns:w="http://schemas.openxmlformats.org/wordprocessingml/2006/main" xmlns:w14="http://schemas.microsoft.com/office/word/2010/wordml" xmlns:w15="http://schemas.microsoft.com/office/word/2012/wordml" xmlns:w16cex="http://schemas.microsoft.com/office/word/2018/wordml/cex" xmlns:w16cid="http://schemas.microsoft.com/office/word/2016/wordml/cid" xmlns:w16="http://schemas.microsoft.com/office/word/2018/wordml" xmlns:w16du="http://schemas.microsoft.com/office/word/2023/wordml/word16du" xmlns:w16sdtdh="http://schemas.microsoft.com/office/word/2020/wordml/sdtdatahash" xmlns:w16sdtfl="http://schemas.microsoft.com/office/word/2024/wordml/sdtformatlock" xmlns:w16se="http://schemas.microsoft.com/office/word/2015/wordml/symex" mc:Ignorable="w14 w15 w16se w16cid w16 w16cex w16sdtdh w16sdtfl w16du">
+<w:styles xmlns:mc="http://schemas.openxmlformats.org/markup-compatibility/2006" xmlns:r="http://schemas.openxmlformats.org/officeDocument/2006/relationships" xmlns:w="http://schemas.openxmlformats.org/wordprocessingml/2006/main" xmlns:w14="http://schemas.microsoft.com/office/word/2010/wordml" xmlns:w15="http://schemas.microsoft.com/office/word/2012/wordml" xmlns:w16cex="http://schemas.microsoft.com/office/word/2018/wordml/cex" xmlns:w16cid="http://schemas.microsoft.com/office/word/2016/wordml/cid" xmlns:w16="http://schemas.microsoft.com/office/word/2018/wordml" xmlns:w16sdtdh="http://schemas.microsoft.com/office/word/2020/wordml/sdtdatahash" xmlns:w16se="http://schemas.microsoft.com/office/word/2015/wordml/symex" mc:Ignorable="w14 w15 w16se w16cid w16 w16cex w16sdtdh">
   <w:docDefaults>
     <w:rPrDefault>
       <w:rPr>
@@ -2527,6 +2677,7 @@
   <w:style w:type="character" w:default="1" w:styleId="Bekezdsalapbettpusa">
     <w:name w:val="Default Paragraph Font"/>
     <w:uiPriority w:val="1"/>
+    <w:semiHidden/>
     <w:unhideWhenUsed/>
   </w:style>
   <w:style w:type="table" w:default="1" w:styleId="Normltblzat">
@@ -3679,15 +3830,6 @@
 </file>
 
 <file path=customXml/item1.xml><?xml version="1.0" encoding="utf-8"?>
-<?mso-contentType ?>
-<FormTemplates xmlns="http://schemas.microsoft.com/sharepoint/v3/contenttype/forms">
-  <Display>DocumentLibraryForm</Display>
-  <Edit>DocumentLibraryForm</Edit>
-  <New>DocumentLibraryForm</New>
-</FormTemplates>
-</file>
-
-<file path=customXml/item2.xml><?xml version="1.0" encoding="utf-8"?>
 <ct:contentTypeSchema xmlns:ct="http://schemas.microsoft.com/office/2006/metadata/contentType" xmlns:ma="http://schemas.microsoft.com/office/2006/metadata/properties/metaAttributes" ct:_="" ma:_="" ma:contentTypeName="Document" ma:contentTypeID="0x01010013532243B581414188EF3F59D33FEB25" ma:contentTypeVersion="6" ma:contentTypeDescription="Create a new document." ma:contentTypeScope="" ma:versionID="3c8ff5c8fdb75f7e7c005cd9498d9aad">
   <xsd:schema xmlns:xsd="http://www.w3.org/2001/XMLSchema" xmlns:xs="http://www.w3.org/2001/XMLSchema" xmlns:p="http://schemas.microsoft.com/office/2006/metadata/properties" xmlns:ns2="ed64fe2c-2946-441a-bdf3-2120a1702011" xmlns:ns3="133b811b-0bc4-4944-9685-9128c8db5870" targetNamespace="http://schemas.microsoft.com/office/2006/metadata/properties" ma:root="true" ma:fieldsID="662e73e34ba43cc7db50fd596a5f3802" ns2:_="" ns3:_="">
     <xsd:import namespace="ed64fe2c-2946-441a-bdf3-2120a1702011"/>
@@ -3866,25 +4008,26 @@
 </ct:contentTypeSchema>
 </file>
 
-<file path=customXml/item3.xml><?xml version="1.0" encoding="utf-8"?>
-<b:Sources xmlns:b="http://schemas.openxmlformats.org/officeDocument/2006/bibliography" xmlns="http://schemas.openxmlformats.org/officeDocument/2006/bibliography" SelectedStyle="\APA.XSL" StyleName="APA"/>
+<file path=customXml/item2.xml><?xml version="1.0" encoding="utf-8"?>
+<?mso-contentType ?>
+<FormTemplates xmlns="http://schemas.microsoft.com/sharepoint/v3/contenttype/forms">
+  <Display>DocumentLibraryForm</Display>
+  <Edit>DocumentLibraryForm</Edit>
+  <New>DocumentLibraryForm</New>
+</FormTemplates>
 </file>
 
-<file path=customXml/item4.xml><?xml version="1.0" encoding="utf-8"?>
+<file path=customXml/item3.xml><?xml version="1.0" encoding="utf-8"?>
 <p:properties xmlns:p="http://schemas.microsoft.com/office/2006/metadata/properties" xmlns:xsi="http://www.w3.org/2001/XMLSchema-instance" xmlns:pc="http://schemas.microsoft.com/office/infopath/2007/PartnerControls">
   <documentManagement/>
 </p:properties>
 </file>
 
-<file path=customXml/itemProps1.xml><?xml version="1.0" encoding="utf-8"?>
-<ds:datastoreItem xmlns:ds="http://schemas.openxmlformats.org/officeDocument/2006/customXml" ds:itemID="{BEAA3410-39A0-400F-954D-D477DC421977}">
-  <ds:schemaRefs>
-    <ds:schemaRef ds:uri="http://schemas.microsoft.com/sharepoint/v3/contenttype/forms"/>
-  </ds:schemaRefs>
-</ds:datastoreItem>
+<file path=customXml/item4.xml><?xml version="1.0" encoding="utf-8"?>
+<b:Sources xmlns:b="http://schemas.openxmlformats.org/officeDocument/2006/bibliography" xmlns="http://schemas.openxmlformats.org/officeDocument/2006/bibliography" SelectedStyle="\APA.XSL" StyleName="APA"/>
 </file>
 
-<file path=customXml/itemProps2.xml><?xml version="1.0" encoding="utf-8"?>
+<file path=customXml/itemProps1.xml><?xml version="1.0" encoding="utf-8"?>
 <ds:datastoreItem xmlns:ds="http://schemas.openxmlformats.org/officeDocument/2006/customXml" ds:itemID="{0897306F-4ACF-44AC-A4F8-E0D3818859D0}">
   <ds:schemaRefs>
     <ds:schemaRef ds:uri="http://schemas.microsoft.com/office/2006/metadata/contentType"/>
@@ -3903,19 +4046,27 @@
 </ds:datastoreItem>
 </file>
 
-<file path=customXml/itemProps3.xml><?xml version="1.0" encoding="utf-8"?>
-<ds:datastoreItem xmlns:ds="http://schemas.openxmlformats.org/officeDocument/2006/customXml" ds:itemID="{F2C35FEF-1B90-4171-BF31-30718714B00B}">
+<file path=customXml/itemProps2.xml><?xml version="1.0" encoding="utf-8"?>
+<ds:datastoreItem xmlns:ds="http://schemas.openxmlformats.org/officeDocument/2006/customXml" ds:itemID="{BEAA3410-39A0-400F-954D-D477DC421977}">
   <ds:schemaRefs>
-    <ds:schemaRef ds:uri="http://schemas.openxmlformats.org/officeDocument/2006/bibliography"/>
+    <ds:schemaRef ds:uri="http://schemas.microsoft.com/sharepoint/v3/contenttype/forms"/>
   </ds:schemaRefs>
 </ds:datastoreItem>
 </file>
 
-<file path=customXml/itemProps4.xml><?xml version="1.0" encoding="utf-8"?>
+<file path=customXml/itemProps3.xml><?xml version="1.0" encoding="utf-8"?>
 <ds:datastoreItem xmlns:ds="http://schemas.openxmlformats.org/officeDocument/2006/customXml" ds:itemID="{448DC41E-2BDB-46C2-9930-EE3043C4CEF4}">
   <ds:schemaRefs>
     <ds:schemaRef ds:uri="http://schemas.microsoft.com/office/2006/metadata/properties"/>
     <ds:schemaRef ds:uri="http://schemas.microsoft.com/office/infopath/2007/PartnerControls"/>
   </ds:schemaRefs>
 </ds:datastoreItem>
+</file>
+
+<file path=customXml/itemProps4.xml><?xml version="1.0" encoding="utf-8"?>
+<ds:datastoreItem xmlns:ds="http://schemas.openxmlformats.org/officeDocument/2006/customXml" ds:itemID="{F2C35FEF-1B90-4171-BF31-30718714B00B}">
+  <ds:schemaRefs>
+    <ds:schemaRef ds:uri="http://schemas.openxmlformats.org/officeDocument/2006/bibliography"/>
+  </ds:schemaRefs>
+</ds:datastoreItem>
 </file>
</xml_diff>

<commit_message>
feat: Added 5 more tests
</commit_message>
<xml_diff>
--- a/SZOFTECH_Lab4_R29SVR.docx
+++ b/SZOFTECH_Lab4_R29SVR.docx
@@ -571,6 +571,9 @@
         <w:t>Teszttervezés</w:t>
       </w:r>
     </w:p>
+    <w:p/>
+    <w:p/>
+    <w:p/>
     <w:tbl>
       <w:tblPr>
         <w:tblStyle w:val="Rcsostblzat"/>
@@ -578,17 +581,20 @@
         <w:tblLook w:val="04A0" w:firstRow="1" w:lastRow="0" w:firstColumn="1" w:lastColumn="0" w:noHBand="0" w:noVBand="1"/>
       </w:tblPr>
       <w:tblGrid>
-        <w:gridCol w:w="4606"/>
-        <w:gridCol w:w="4606"/>
+        <w:gridCol w:w="2303"/>
+        <w:gridCol w:w="2303"/>
+        <w:gridCol w:w="2303"/>
+        <w:gridCol w:w="2341"/>
       </w:tblGrid>
       <w:tr>
         <w:tc>
           <w:tcPr>
-            <w:tcW w:w="4606" w:type="dxa"/>
+            <w:tcW w:w="2303" w:type="dxa"/>
           </w:tcPr>
           <w:p>
             <w:pPr>
               <w:pStyle w:val="Code"/>
+              <w:jc w:val="right"/>
             </w:pPr>
             <w:r>
               <w:t>Teszt követelmény</w:t>
@@ -597,22 +603,7 @@
         </w:tc>
         <w:tc>
           <w:tcPr>
-            <w:tcW w:w="4606" w:type="dxa"/>
-          </w:tcPr>
-          <w:p>
-            <w:pPr>
-              <w:pStyle w:val="Code"/>
-            </w:pPr>
-            <w:r>
-              <w:t>A GT4500 inicializálása 0 torpedóval a primary és a secondary-ben is-is.</w:t>
-            </w:r>
-          </w:p>
-        </w:tc>
-      </w:tr>
-      <w:tr>
-        <w:tc>
-          <w:tcPr>
-            <w:tcW w:w="4606" w:type="dxa"/>
+            <w:tcW w:w="2303" w:type="dxa"/>
           </w:tcPr>
           <w:p>
             <w:pPr>
@@ -625,22 +616,7 @@
         </w:tc>
         <w:tc>
           <w:tcPr>
-            <w:tcW w:w="4606" w:type="dxa"/>
-          </w:tcPr>
-          <w:p>
-            <w:pPr>
-              <w:pStyle w:val="Code"/>
-            </w:pPr>
-            <w:r>
-              <w:t>A GT4500 osztály példányában nincsen torpedó, se az primary, se a secondary bayben.</w:t>
-            </w:r>
-          </w:p>
-        </w:tc>
-      </w:tr>
-      <w:tr>
-        <w:tc>
-          <w:tcPr>
-            <w:tcW w:w="4606" w:type="dxa"/>
+            <w:tcW w:w="2303" w:type="dxa"/>
           </w:tcPr>
           <w:p>
             <w:pPr>
@@ -653,7 +629,48 @@
         </w:tc>
         <w:tc>
           <w:tcPr>
-            <w:tcW w:w="4606" w:type="dxa"/>
+            <w:tcW w:w="2341" w:type="dxa"/>
+          </w:tcPr>
+          <w:p>
+            <w:pPr>
+              <w:pStyle w:val="Code"/>
+            </w:pPr>
+            <w:r>
+              <w:t>Elvárt kimenet</w:t>
+            </w:r>
+          </w:p>
+        </w:tc>
+      </w:tr>
+      <w:tr>
+        <w:tc>
+          <w:tcPr>
+            <w:tcW w:w="2303" w:type="dxa"/>
+          </w:tcPr>
+          <w:p>
+            <w:pPr>
+              <w:pStyle w:val="Code"/>
+            </w:pPr>
+            <w:r>
+              <w:t>A GT4500 inicializálása 0 torpedóval a primary és a secondary-ben is-is.</w:t>
+            </w:r>
+          </w:p>
+        </w:tc>
+        <w:tc>
+          <w:tcPr>
+            <w:tcW w:w="2303" w:type="dxa"/>
+          </w:tcPr>
+          <w:p>
+            <w:pPr>
+              <w:pStyle w:val="Code"/>
+            </w:pPr>
+            <w:r>
+              <w:t>A GT4500 osztály példányában nincsen torpedó, se az primary, se a secondary bayben.</w:t>
+            </w:r>
+          </w:p>
+        </w:tc>
+        <w:tc>
+          <w:tcPr>
+            <w:tcW w:w="2303" w:type="dxa"/>
           </w:tcPr>
           <w:p>
             <w:pPr>
@@ -664,24 +681,9 @@
             </w:r>
           </w:p>
         </w:tc>
-      </w:tr>
-      <w:tr>
         <w:tc>
           <w:tcPr>
-            <w:tcW w:w="4606" w:type="dxa"/>
-          </w:tcPr>
-          <w:p>
-            <w:pPr>
-              <w:pStyle w:val="Code"/>
-            </w:pPr>
-            <w:r>
-              <w:t>Elvárt kimenet</w:t>
-            </w:r>
-          </w:p>
-        </w:tc>
-        <w:tc>
-          <w:tcPr>
-            <w:tcW w:w="4606" w:type="dxa"/>
+            <w:tcW w:w="2341" w:type="dxa"/>
           </w:tcPr>
           <w:p>
             <w:pPr>
@@ -693,34 +695,453 @@
           </w:p>
         </w:tc>
       </w:tr>
+      <w:tr>
+        <w:tc>
+          <w:tcPr>
+            <w:tcW w:w="2303" w:type="dxa"/>
+          </w:tcPr>
+          <w:p>
+            <w:pPr>
+              <w:pStyle w:val="Code"/>
+            </w:pPr>
+            <w:r>
+              <w:t>A GT4500 inicializálása 0 torpedóval a primary és a secondary-ben is-is.</w:t>
+            </w:r>
+          </w:p>
+        </w:tc>
+        <w:tc>
+          <w:tcPr>
+            <w:tcW w:w="2303" w:type="dxa"/>
+          </w:tcPr>
+          <w:p>
+            <w:pPr>
+              <w:pStyle w:val="Code"/>
+            </w:pPr>
+            <w:r>
+              <w:t>A GT4500 osztály példányában nincsen torpedó, se az primary, se a secondary bayben.</w:t>
+            </w:r>
+          </w:p>
+        </w:tc>
+        <w:tc>
+          <w:tcPr>
+            <w:tcW w:w="2303" w:type="dxa"/>
+          </w:tcPr>
+          <w:p>
+            <w:pPr>
+              <w:pStyle w:val="Code"/>
+            </w:pPr>
+            <w:r>
+              <w:t xml:space="preserve">fireTorpedo(…) meghívása </w:t>
+            </w:r>
+            <w:r>
+              <w:t>ALL</w:t>
+            </w:r>
+            <w:r>
+              <w:t xml:space="preserve"> módban.</w:t>
+            </w:r>
+          </w:p>
+        </w:tc>
+        <w:tc>
+          <w:tcPr>
+            <w:tcW w:w="2341" w:type="dxa"/>
+          </w:tcPr>
+          <w:p>
+            <w:pPr>
+              <w:pStyle w:val="Code"/>
+            </w:pPr>
+            <w:r>
+              <w:t>FAIL</w:t>
+            </w:r>
+          </w:p>
+        </w:tc>
+      </w:tr>
+      <w:tr>
+        <w:tc>
+          <w:tcPr>
+            <w:tcW w:w="2303" w:type="dxa"/>
+          </w:tcPr>
+          <w:p>
+            <w:pPr>
+              <w:pStyle w:val="Code"/>
+            </w:pPr>
+            <w:r>
+              <w:lastRenderedPageBreak/>
+              <w:t>A GT4500 inicializálása 1 torpedóval a primary store-ban.</w:t>
+            </w:r>
+          </w:p>
+        </w:tc>
+        <w:tc>
+          <w:tcPr>
+            <w:tcW w:w="2303" w:type="dxa"/>
+          </w:tcPr>
+          <w:p>
+            <w:pPr>
+              <w:pStyle w:val="Code"/>
+            </w:pPr>
+            <w:r>
+              <w:t>A GT4500 inicializált példány 1 torpedóval a primary store-ban.</w:t>
+            </w:r>
+          </w:p>
+        </w:tc>
+        <w:tc>
+          <w:tcPr>
+            <w:tcW w:w="2303" w:type="dxa"/>
+          </w:tcPr>
+          <w:p>
+            <w:pPr>
+              <w:pStyle w:val="Code"/>
+            </w:pPr>
+            <w:r>
+              <w:t>fireTorpedo(…) meghívása SINGLE módban.</w:t>
+            </w:r>
+          </w:p>
+        </w:tc>
+        <w:tc>
+          <w:tcPr>
+            <w:tcW w:w="2341" w:type="dxa"/>
+          </w:tcPr>
+          <w:p>
+            <w:pPr>
+              <w:pStyle w:val="Code"/>
+            </w:pPr>
+            <w:r>
+              <w:t>SUCCESS</w:t>
+            </w:r>
+          </w:p>
+        </w:tc>
+      </w:tr>
+      <w:tr>
+        <w:tc>
+          <w:tcPr>
+            <w:tcW w:w="2303" w:type="dxa"/>
+          </w:tcPr>
+          <w:p>
+            <w:pPr>
+              <w:pStyle w:val="Code"/>
+            </w:pPr>
+            <w:r>
+              <w:t>A GT4500 inicializálása 1 torpedóval a primary store-ban.</w:t>
+            </w:r>
+          </w:p>
+        </w:tc>
+        <w:tc>
+          <w:tcPr>
+            <w:tcW w:w="2303" w:type="dxa"/>
+          </w:tcPr>
+          <w:p>
+            <w:pPr>
+              <w:pStyle w:val="Code"/>
+            </w:pPr>
+            <w:r>
+              <w:t>A GT4500 inicializált példány 1 torpedóval a primary store-ban.</w:t>
+            </w:r>
+          </w:p>
+        </w:tc>
+        <w:tc>
+          <w:tcPr>
+            <w:tcW w:w="2303" w:type="dxa"/>
+          </w:tcPr>
+          <w:p>
+            <w:pPr>
+              <w:pStyle w:val="Code"/>
+            </w:pPr>
+            <w:r>
+              <w:t xml:space="preserve">fireTorpedo(…) meghívása </w:t>
+            </w:r>
+            <w:r>
+              <w:t>ALL</w:t>
+            </w:r>
+            <w:r>
+              <w:t xml:space="preserve"> módban.</w:t>
+            </w:r>
+          </w:p>
+        </w:tc>
+        <w:tc>
+          <w:tcPr>
+            <w:tcW w:w="2341" w:type="dxa"/>
+          </w:tcPr>
+          <w:p>
+            <w:pPr>
+              <w:pStyle w:val="Code"/>
+            </w:pPr>
+            <w:r>
+              <w:t>SUCCESS</w:t>
+            </w:r>
+          </w:p>
+        </w:tc>
+      </w:tr>
+      <w:tr>
+        <w:tc>
+          <w:tcPr>
+            <w:tcW w:w="2303" w:type="dxa"/>
+          </w:tcPr>
+          <w:p>
+            <w:pPr>
+              <w:pStyle w:val="Code"/>
+            </w:pPr>
+            <w:r>
+              <w:t>A GT4500 inicializálása 1 torpedóval a secondary store-ban.</w:t>
+            </w:r>
+          </w:p>
+        </w:tc>
+        <w:tc>
+          <w:tcPr>
+            <w:tcW w:w="2303" w:type="dxa"/>
+          </w:tcPr>
+          <w:p>
+            <w:pPr>
+              <w:pStyle w:val="Code"/>
+            </w:pPr>
+            <w:r>
+              <w:t>A GT4500 inicializált példány 1 torpedóval a secondary store-ban.</w:t>
+            </w:r>
+          </w:p>
+        </w:tc>
+        <w:tc>
+          <w:tcPr>
+            <w:tcW w:w="2303" w:type="dxa"/>
+          </w:tcPr>
+          <w:p>
+            <w:pPr>
+              <w:pStyle w:val="Code"/>
+            </w:pPr>
+            <w:r>
+              <w:t>fireTorpedo(…) meghívása SINGLE módban.</w:t>
+            </w:r>
+          </w:p>
+        </w:tc>
+        <w:tc>
+          <w:tcPr>
+            <w:tcW w:w="2341" w:type="dxa"/>
+          </w:tcPr>
+          <w:p>
+            <w:pPr>
+              <w:pStyle w:val="Code"/>
+            </w:pPr>
+            <w:r>
+              <w:t>SUCCESS</w:t>
+            </w:r>
+          </w:p>
+        </w:tc>
+      </w:tr>
+      <w:tr>
+        <w:tc>
+          <w:tcPr>
+            <w:tcW w:w="2303" w:type="dxa"/>
+          </w:tcPr>
+          <w:p>
+            <w:pPr>
+              <w:pStyle w:val="Code"/>
+            </w:pPr>
+            <w:r>
+              <w:t>A GT4500 inicializálása 1 torpedóval a secondary store-ban.</w:t>
+            </w:r>
+          </w:p>
+        </w:tc>
+        <w:tc>
+          <w:tcPr>
+            <w:tcW w:w="2303" w:type="dxa"/>
+          </w:tcPr>
+          <w:p>
+            <w:pPr>
+              <w:pStyle w:val="Code"/>
+            </w:pPr>
+            <w:r>
+              <w:t>A GT4500 inicializált példány 1 torpedóval a secondary store-ban.</w:t>
+            </w:r>
+          </w:p>
+        </w:tc>
+        <w:tc>
+          <w:tcPr>
+            <w:tcW w:w="2303" w:type="dxa"/>
+          </w:tcPr>
+          <w:p>
+            <w:pPr>
+              <w:pStyle w:val="Code"/>
+            </w:pPr>
+            <w:r>
+              <w:t xml:space="preserve">fireTorpedo(…) meghívása </w:t>
+            </w:r>
+            <w:r>
+              <w:t>ALL</w:t>
+            </w:r>
+            <w:r>
+              <w:t xml:space="preserve"> módban.</w:t>
+            </w:r>
+          </w:p>
+        </w:tc>
+        <w:tc>
+          <w:tcPr>
+            <w:tcW w:w="2341" w:type="dxa"/>
+          </w:tcPr>
+          <w:p>
+            <w:pPr>
+              <w:pStyle w:val="Code"/>
+            </w:pPr>
+            <w:r>
+              <w:t>SUCCESS</w:t>
+            </w:r>
+          </w:p>
+        </w:tc>
+      </w:tr>
+      <w:tr>
+        <w:tc>
+          <w:tcPr>
+            <w:tcW w:w="2303" w:type="dxa"/>
+          </w:tcPr>
+          <w:p>
+            <w:pPr>
+              <w:pStyle w:val="Code"/>
+            </w:pPr>
+          </w:p>
+        </w:tc>
+        <w:tc>
+          <w:tcPr>
+            <w:tcW w:w="2303" w:type="dxa"/>
+          </w:tcPr>
+          <w:p>
+            <w:pPr>
+              <w:pStyle w:val="Code"/>
+            </w:pPr>
+          </w:p>
+        </w:tc>
+        <w:tc>
+          <w:tcPr>
+            <w:tcW w:w="2303" w:type="dxa"/>
+          </w:tcPr>
+          <w:p>
+            <w:pPr>
+              <w:pStyle w:val="Code"/>
+            </w:pPr>
+          </w:p>
+        </w:tc>
+        <w:tc>
+          <w:tcPr>
+            <w:tcW w:w="2341" w:type="dxa"/>
+          </w:tcPr>
+          <w:p>
+            <w:pPr>
+              <w:pStyle w:val="Code"/>
+            </w:pPr>
+          </w:p>
+        </w:tc>
+      </w:tr>
+      <w:tr>
+        <w:tc>
+          <w:tcPr>
+            <w:tcW w:w="2303" w:type="dxa"/>
+          </w:tcPr>
+          <w:p>
+            <w:pPr>
+              <w:pStyle w:val="Code"/>
+            </w:pPr>
+          </w:p>
+        </w:tc>
+        <w:tc>
+          <w:tcPr>
+            <w:tcW w:w="2303" w:type="dxa"/>
+          </w:tcPr>
+          <w:p>
+            <w:pPr>
+              <w:pStyle w:val="Code"/>
+            </w:pPr>
+          </w:p>
+        </w:tc>
+        <w:tc>
+          <w:tcPr>
+            <w:tcW w:w="2303" w:type="dxa"/>
+          </w:tcPr>
+          <w:p>
+            <w:pPr>
+              <w:pStyle w:val="Code"/>
+            </w:pPr>
+          </w:p>
+        </w:tc>
+        <w:tc>
+          <w:tcPr>
+            <w:tcW w:w="2341" w:type="dxa"/>
+          </w:tcPr>
+          <w:p>
+            <w:pPr>
+              <w:pStyle w:val="Code"/>
+            </w:pPr>
+          </w:p>
+        </w:tc>
+      </w:tr>
+      <w:tr>
+        <w:tc>
+          <w:tcPr>
+            <w:tcW w:w="2303" w:type="dxa"/>
+          </w:tcPr>
+          <w:p>
+            <w:pPr>
+              <w:pStyle w:val="Code"/>
+            </w:pPr>
+          </w:p>
+        </w:tc>
+        <w:tc>
+          <w:tcPr>
+            <w:tcW w:w="2303" w:type="dxa"/>
+          </w:tcPr>
+          <w:p>
+            <w:pPr>
+              <w:pStyle w:val="Code"/>
+            </w:pPr>
+          </w:p>
+        </w:tc>
+        <w:tc>
+          <w:tcPr>
+            <w:tcW w:w="2303" w:type="dxa"/>
+          </w:tcPr>
+          <w:p>
+            <w:pPr>
+              <w:pStyle w:val="Code"/>
+            </w:pPr>
+          </w:p>
+        </w:tc>
+        <w:tc>
+          <w:tcPr>
+            <w:tcW w:w="2341" w:type="dxa"/>
+          </w:tcPr>
+          <w:p>
+            <w:pPr>
+              <w:pStyle w:val="Code"/>
+            </w:pPr>
+          </w:p>
+        </w:tc>
+      </w:tr>
     </w:tbl>
     <w:p>
       <w:pPr>
         <w:pStyle w:val="Code"/>
       </w:pPr>
-      <w:r>
-        <w:t>Ezt a tesztet azért választottuk, ohgy teszteljük, hogy nem történik-e hamis tüzelés, hogyha a primary és a secondary is-is üres.</w:t>
-      </w:r>
     </w:p>
     <w:p>
       <w:pPr>
-        <w:pStyle w:val="Cmsor1"/>
-      </w:pPr>
-      <w:r>
-        <w:t xml:space="preserve">Feladat: </w:t>
+        <w:pStyle w:val="Code"/>
+      </w:pPr>
+      <w:r>
+        <w:t>Ezt a tesztet azért választottuk, ohgy teszteljük, hogy nem történik-e hamis tüzelés, hogyha a primary és a secondary is-is üres.</w:t>
       </w:r>
     </w:p>
     <w:p>
       <w:pPr>
-        <w:pStyle w:val="Code"/>
-      </w:pPr>
+        <w:pStyle w:val="Cmsor1"/>
+      </w:pPr>
+      <w:r>
+        <w:t xml:space="preserve">Feladat: </w:t>
+      </w:r>
     </w:p>
     <w:p>
       <w:pPr>
+        <w:pStyle w:val="Code"/>
+      </w:pPr>
+    </w:p>
+    <w:p>
+      <w:pPr>
         <w:pStyle w:val="Cmsor1"/>
       </w:pPr>
       <w:r>
-        <w:lastRenderedPageBreak/>
         <w:t xml:space="preserve">Feladat: </w:t>
       </w:r>
     </w:p>

</xml_diff>